<commit_message>
Pensando a cosa si riferisce questa frase minimalistaPensando a cosa si riferisce questa frase minimalistagii-editing-ti: pulizia codice morto, fix case-insensitive campi FL, simbolo € nota spese; aggiornato base-pdf template
</commit_message>
<xml_diff>
--- a/your-extensions/widgets/_shared/gii-anteprime/rapporto/rapporto-template.docx
+++ b/your-extensions/widgets/_shared/gii-anteprime/rapporto/rapporto-template.docx
@@ -4395,6 +4395,9 @@
           <w:tcPr>
             <w:tcW w:w="2835" w:type="dxa"/>
             <w:gridSpan w:val="7"/>
+            <w:tcBorders>
+              <w:right w:val="nil"/>
+            </w:tcBorders>
             <w:tcMar>
               <w:top w:w="79" w:type="dxa"/>
               <w:left w:w="57" w:type="dxa"/>
@@ -4419,6 +4422,9 @@
           <w:tcPr>
             <w:tcW w:w="4590" w:type="dxa"/>
             <w:gridSpan w:val="13"/>
+            <w:tcBorders>
+              <w:left w:val="nil"/>
+            </w:tcBorders>
             <w:tcMar>
               <w:top w:w="79" w:type="dxa"/>
               <w:left w:w="57" w:type="dxa"/>

</xml_diff>

<commit_message>
gii-editing-ti: pulizia EmbeddedMapPanel, fix case-insensitive campi FL, € nota spese, importi allineati a destra, preview allegati full-height con tema dark; aggiornato base-pdf template
</commit_message>
<xml_diff>
--- a/your-extensions/widgets/_shared/gii-anteprime/rapporto/rapporto-template.docx
+++ b/your-extensions/widgets/_shared/gii-anteprime/rapporto/rapporto-template.docx
@@ -4452,7 +4452,29 @@
                 <w:sz w:val="14"/>
                 <w:szCs w:val="14"/>
               </w:rPr>
-              <w:t>(Vedi nota spesa allegata)</w:t>
+              <w:t>(Vedi nota spes</w:t>
+            </w:r>
+            <w:r>
+              <w:rPr>
+                <w:rFonts w:ascii="Calibri" w:hAnsi="Calibri" w:cs="Calibri"/>
+                <w:i/>
+                <w:iCs/>
+                <w:color w:val="005B8C"/>
+                <w:sz w:val="14"/>
+                <w:szCs w:val="14"/>
+              </w:rPr>
+              <w:t>e</w:t>
+            </w:r>
+            <w:r>
+              <w:rPr>
+                <w:rFonts w:ascii="Calibri" w:hAnsi="Calibri" w:cs="Calibri"/>
+                <w:i/>
+                <w:iCs/>
+                <w:color w:val="005B8C"/>
+                <w:sz w:val="14"/>
+                <w:szCs w:val="14"/>
+              </w:rPr>
+              <w:t xml:space="preserve"> allegata)</w:t>
             </w:r>
           </w:p>
         </w:tc>
@@ -6526,31 +6548,7 @@
               <w:szCs w:val="10"/>
               <w:lang w:val="en-US" w:eastAsia="en-US"/>
             </w:rPr>
-            <w:t xml:space="preserve">web </w:t>
-          </w:r>
-          <w:proofErr w:type="gramStart"/>
-          <w:r>
-            <w:rPr>
-              <w:rFonts w:ascii="Arial" w:eastAsia="Arial" w:hAnsi="Arial" w:cs="Arial"/>
-              <w:bCs/>
-              <w:color w:val="auto"/>
-              <w:sz w:val="10"/>
-              <w:szCs w:val="10"/>
-              <w:lang w:val="en-US" w:eastAsia="en-US"/>
-            </w:rPr>
-            <w:t>http://www.cbsm.it  email</w:t>
-          </w:r>
-          <w:proofErr w:type="gramEnd"/>
-          <w:r>
-            <w:rPr>
-              <w:rFonts w:ascii="Arial" w:eastAsia="Arial" w:hAnsi="Arial" w:cs="Arial"/>
-              <w:bCs/>
-              <w:color w:val="auto"/>
-              <w:sz w:val="10"/>
-              <w:szCs w:val="10"/>
-              <w:lang w:val="en-US" w:eastAsia="en-US"/>
-            </w:rPr>
-            <w:t xml:space="preserve"> </w:t>
+            <w:t xml:space="preserve">web http://www.cbsm.it  email </w:t>
           </w:r>
           <w:hyperlink r:id="rId1" w:history="1">
             <w:r>

</xml_diff>

<commit_message>
Aggiunta scheda Dati generali
</commit_message>
<xml_diff>
--- a/your-extensions/widgets/_shared/gii-anteprime/rapporto/rapporto-template.docx
+++ b/your-extensions/widgets/_shared/gii-anteprime/rapporto/rapporto-template.docx
@@ -230,7 +230,7 @@
       </w:tr>
       <w:tr>
         <w:trPr>
-          <w:trHeight w:val="1491"/>
+          <w:trHeight w:val="1076"/>
           <w:jc w:val="center"/>
         </w:trPr>
         <w:tc>
@@ -276,6 +276,9 @@
           <w:tcPr>
             <w:tcW w:w="1340" w:type="dxa"/>
             <w:gridSpan w:val="3"/>
+            <w:tcBorders>
+              <w:bottom w:val="single" w:sz="4" w:space="0" w:color="ADADAD" w:themeColor="background2" w:themeShade="BF"/>
+            </w:tcBorders>
             <w:shd w:val="clear" w:color="auto" w:fill="DAEAF5"/>
             <w:noWrap/>
             <w:tcMar>
@@ -312,6 +315,9 @@
           <w:tcPr>
             <w:tcW w:w="3900" w:type="dxa"/>
             <w:gridSpan w:val="11"/>
+            <w:tcBorders>
+              <w:bottom w:val="single" w:sz="4" w:space="0" w:color="ADADAD" w:themeColor="background2" w:themeShade="BF"/>
+            </w:tcBorders>
             <w:tcMar>
               <w:top w:w="79" w:type="dxa"/>
               <w:left w:w="57" w:type="dxa"/>
@@ -339,6 +345,9 @@
           <w:tcPr>
             <w:tcW w:w="992" w:type="dxa"/>
             <w:gridSpan w:val="3"/>
+            <w:tcBorders>
+              <w:bottom w:val="single" w:sz="4" w:space="0" w:color="ADADAD" w:themeColor="background2" w:themeShade="BF"/>
+            </w:tcBorders>
             <w:shd w:val="clear" w:color="auto" w:fill="DAEAF5"/>
             <w:tcMar>
               <w:top w:w="79" w:type="dxa"/>
@@ -376,6 +385,9 @@
           <w:tcPr>
             <w:tcW w:w="993" w:type="dxa"/>
             <w:gridSpan w:val="3"/>
+            <w:tcBorders>
+              <w:bottom w:val="single" w:sz="4" w:space="0" w:color="ADADAD" w:themeColor="background2" w:themeShade="BF"/>
+            </w:tcBorders>
             <w:tcMar>
               <w:top w:w="79" w:type="dxa"/>
               <w:left w:w="57" w:type="dxa"/>
@@ -403,6 +415,9 @@
           <w:tcPr>
             <w:tcW w:w="850" w:type="dxa"/>
             <w:gridSpan w:val="3"/>
+            <w:tcBorders>
+              <w:bottom w:val="single" w:sz="4" w:space="0" w:color="ADADAD" w:themeColor="background2" w:themeShade="BF"/>
+            </w:tcBorders>
             <w:shd w:val="clear" w:color="auto" w:fill="DAEAF5"/>
             <w:tcMar>
               <w:top w:w="79" w:type="dxa"/>
@@ -440,6 +455,9 @@
           <w:tcPr>
             <w:tcW w:w="1330" w:type="dxa"/>
             <w:gridSpan w:val="3"/>
+            <w:tcBorders>
+              <w:bottom w:val="single" w:sz="4" w:space="0" w:color="ADADAD" w:themeColor="background2" w:themeShade="BF"/>
+            </w:tcBorders>
             <w:tcMar>
               <w:top w:w="79" w:type="dxa"/>
               <w:left w:w="57" w:type="dxa"/>
@@ -472,6 +490,10 @@
           <w:tcPr>
             <w:tcW w:w="9405" w:type="dxa"/>
             <w:gridSpan w:val="26"/>
+            <w:tcBorders>
+              <w:left w:val="nil"/>
+              <w:right w:val="nil"/>
+            </w:tcBorders>
             <w:noWrap/>
             <w:tcMar>
               <w:top w:w="79" w:type="dxa"/>
@@ -4452,8 +4474,9 @@
                 <w:sz w:val="14"/>
                 <w:szCs w:val="14"/>
               </w:rPr>
-              <w:t>(Vedi nota spes</w:t>
-            </w:r>
+              <w:t xml:space="preserve">(Vedi </w:t>
+            </w:r>
+            <w:proofErr w:type="gramStart"/>
             <w:r>
               <w:rPr>
                 <w:rFonts w:ascii="Calibri" w:hAnsi="Calibri" w:cs="Calibri"/>
@@ -4463,8 +4486,20 @@
                 <w:sz w:val="14"/>
                 <w:szCs w:val="14"/>
               </w:rPr>
+              <w:t>nota spes</w:t>
+            </w:r>
+            <w:r>
+              <w:rPr>
+                <w:rFonts w:ascii="Calibri" w:hAnsi="Calibri" w:cs="Calibri"/>
+                <w:i/>
+                <w:iCs/>
+                <w:color w:val="005B8C"/>
+                <w:sz w:val="14"/>
+                <w:szCs w:val="14"/>
+              </w:rPr>
               <w:t>e</w:t>
             </w:r>
+            <w:proofErr w:type="gramEnd"/>
             <w:r>
               <w:rPr>
                 <w:rFonts w:ascii="Calibri" w:hAnsi="Calibri" w:cs="Calibri"/>
@@ -6548,7 +6583,31 @@
               <w:szCs w:val="10"/>
               <w:lang w:val="en-US" w:eastAsia="en-US"/>
             </w:rPr>
-            <w:t xml:space="preserve">web http://www.cbsm.it  email </w:t>
+            <w:t xml:space="preserve">web </w:t>
+          </w:r>
+          <w:proofErr w:type="gramStart"/>
+          <w:r>
+            <w:rPr>
+              <w:rFonts w:ascii="Arial" w:eastAsia="Arial" w:hAnsi="Arial" w:cs="Arial"/>
+              <w:bCs/>
+              <w:color w:val="auto"/>
+              <w:sz w:val="10"/>
+              <w:szCs w:val="10"/>
+              <w:lang w:val="en-US" w:eastAsia="en-US"/>
+            </w:rPr>
+            <w:t>http://www.cbsm.it  email</w:t>
+          </w:r>
+          <w:proofErr w:type="gramEnd"/>
+          <w:r>
+            <w:rPr>
+              <w:rFonts w:ascii="Arial" w:eastAsia="Arial" w:hAnsi="Arial" w:cs="Arial"/>
+              <w:bCs/>
+              <w:color w:val="auto"/>
+              <w:sz w:val="10"/>
+              <w:szCs w:val="10"/>
+              <w:lang w:val="en-US" w:eastAsia="en-US"/>
+            </w:rPr>
+            <w:t xml:space="preserve"> </w:t>
           </w:r>
           <w:hyperlink r:id="rId1" w:history="1">
             <w:r>

</xml_diff>

<commit_message>
feat(gii-rapporto): gestisci note spese multiple per casistica  - Raggruppate le note spese per codice_casistica - Generati allegati distinti e numerati in ordine deterministico - Ripristinato l’importo complessivo nel riepilogo del rapporto - Dicitura laterale resa singolare/plurale in base al numero di note allegate - Allineata la generazione da gii-editing-ti e gii-azioni
</commit_message>
<xml_diff>
--- a/your-extensions/widgets/_shared/gii-anteprime/rapporto/rapporto-template.docx
+++ b/your-extensions/widgets/_shared/gii-anteprime/rapporto/rapporto-template.docx
@@ -4527,52 +4527,6 @@
                 <w:szCs w:val="19"/>
               </w:rPr>
             </w:pPr>
-            <w:r>
-              <w:rPr>
-                <w:rFonts w:ascii="Calibri" w:hAnsi="Calibri" w:cs="Calibri"/>
-                <w:i/>
-                <w:iCs/>
-                <w:color w:val="005B8C"/>
-                <w:sz w:val="14"/>
-                <w:szCs w:val="14"/>
-              </w:rPr>
-              <w:t xml:space="preserve">(Vedi </w:t>
-            </w:r>
-            <w:proofErr w:type="gramStart"/>
-            <w:r>
-              <w:rPr>
-                <w:rFonts w:ascii="Calibri" w:hAnsi="Calibri" w:cs="Calibri"/>
-                <w:i/>
-                <w:iCs/>
-                <w:color w:val="005B8C"/>
-                <w:sz w:val="14"/>
-                <w:szCs w:val="14"/>
-              </w:rPr>
-              <w:t>nota spes</w:t>
-            </w:r>
-            <w:r>
-              <w:rPr>
-                <w:rFonts w:ascii="Calibri" w:hAnsi="Calibri" w:cs="Calibri"/>
-                <w:i/>
-                <w:iCs/>
-                <w:color w:val="005B8C"/>
-                <w:sz w:val="14"/>
-                <w:szCs w:val="14"/>
-              </w:rPr>
-              <w:t>e</w:t>
-            </w:r>
-            <w:proofErr w:type="gramEnd"/>
-            <w:r>
-              <w:rPr>
-                <w:rFonts w:ascii="Calibri" w:hAnsi="Calibri" w:cs="Calibri"/>
-                <w:i/>
-                <w:iCs/>
-                <w:color w:val="005B8C"/>
-                <w:sz w:val="14"/>
-                <w:szCs w:val="14"/>
-              </w:rPr>
-              <w:t xml:space="preserve"> allegata)</w:t>
-            </w:r>
           </w:p>
         </w:tc>
       </w:tr>
@@ -7524,31 +7478,7 @@
               <w:szCs w:val="10"/>
               <w:lang w:val="en-US" w:eastAsia="en-US"/>
             </w:rPr>
-            <w:t xml:space="preserve">web </w:t>
-          </w:r>
-          <w:proofErr w:type="gramStart"/>
-          <w:r>
-            <w:rPr>
-              <w:rFonts w:ascii="Arial" w:eastAsia="Arial" w:hAnsi="Arial" w:cs="Arial"/>
-              <w:bCs/>
-              <w:color w:val="auto"/>
-              <w:sz w:val="10"/>
-              <w:szCs w:val="10"/>
-              <w:lang w:val="en-US" w:eastAsia="en-US"/>
-            </w:rPr>
-            <w:t>http://www.cbsm.it  email</w:t>
-          </w:r>
-          <w:proofErr w:type="gramEnd"/>
-          <w:r>
-            <w:rPr>
-              <w:rFonts w:ascii="Arial" w:eastAsia="Arial" w:hAnsi="Arial" w:cs="Arial"/>
-              <w:bCs/>
-              <w:color w:val="auto"/>
-              <w:sz w:val="10"/>
-              <w:szCs w:val="10"/>
-              <w:lang w:val="en-US" w:eastAsia="en-US"/>
-            </w:rPr>
-            <w:t xml:space="preserve"> </w:t>
+            <w:t xml:space="preserve">web http://www.cbsm.it  email </w:t>
           </w:r>
           <w:hyperlink r:id="rId1" w:history="1">
             <w:r>

</xml_diff>

<commit_message>
git add client/your-extensions/widgets/gii-azioni/src/runtime/widget.tsx \         client/your-extensions/widgets/gii-editing-ti/src/runtime/widget.tsx \         client/your-extensions/widgets/gii-editing-amm/src/runtime/widget.tsx \         client/your-extensions/widgets/gii-dettaglio-pratiche/src/runtime/widget.tsx  git commit -m "Corregge registrazione cicli e audit iter"
</commit_message>
<xml_diff>
--- a/your-extensions/widgets/_shared/gii-anteprime/rapporto/rapporto-template.docx
+++ b/your-extensions/widgets/_shared/gii-anteprime/rapporto/rapporto-template.docx
@@ -93,8 +93,7 @@
         <w:gridCol w:w="412"/>
         <w:gridCol w:w="297"/>
         <w:gridCol w:w="55"/>
-        <w:gridCol w:w="266"/>
-        <w:gridCol w:w="129"/>
+        <w:gridCol w:w="395"/>
         <w:gridCol w:w="117"/>
         <w:gridCol w:w="284"/>
         <w:gridCol w:w="425"/>
@@ -134,7 +133,7 @@
         <w:tc>
           <w:tcPr>
             <w:tcW w:w="10206" w:type="dxa"/>
-            <w:gridSpan w:val="36"/>
+            <w:gridSpan w:val="35"/>
             <w:tcBorders>
               <w:top w:val="nil"/>
               <w:left w:val="nil"/>
@@ -247,7 +246,7 @@
         <w:tc>
           <w:tcPr>
             <w:tcW w:w="10206" w:type="dxa"/>
-            <w:gridSpan w:val="36"/>
+            <w:gridSpan w:val="35"/>
             <w:tcBorders>
               <w:top w:val="nil"/>
               <w:left w:val="nil"/>
@@ -325,7 +324,7 @@
         <w:tc>
           <w:tcPr>
             <w:tcW w:w="4567" w:type="dxa"/>
-            <w:gridSpan w:val="17"/>
+            <w:gridSpan w:val="16"/>
             <w:tcBorders>
               <w:bottom w:val="single" w:sz="4" w:space="0" w:color="ADADAD" w:themeColor="background2" w:themeShade="BF"/>
             </w:tcBorders>
@@ -500,7 +499,7 @@
         <w:tc>
           <w:tcPr>
             <w:tcW w:w="10206" w:type="dxa"/>
-            <w:gridSpan w:val="36"/>
+            <w:gridSpan w:val="35"/>
             <w:tcBorders>
               <w:left w:val="nil"/>
               <w:right w:val="nil"/>
@@ -547,7 +546,7 @@
         <w:tc>
           <w:tcPr>
             <w:tcW w:w="5898" w:type="dxa"/>
-            <w:gridSpan w:val="21"/>
+            <w:gridSpan w:val="20"/>
             <w:shd w:val="clear" w:color="auto" w:fill="005B8C"/>
             <w:noWrap/>
             <w:tcMar>
@@ -768,7 +767,7 @@
         <w:tc>
           <w:tcPr>
             <w:tcW w:w="4678" w:type="dxa"/>
-            <w:gridSpan w:val="17"/>
+            <w:gridSpan w:val="16"/>
             <w:shd w:val="clear" w:color="auto" w:fill="DAEAF5"/>
             <w:tcMar>
               <w:top w:w="0" w:type="dxa"/>
@@ -1040,7 +1039,7 @@
         <w:tc>
           <w:tcPr>
             <w:tcW w:w="4678" w:type="dxa"/>
-            <w:gridSpan w:val="17"/>
+            <w:gridSpan w:val="16"/>
             <w:tcMar>
               <w:top w:w="79" w:type="dxa"/>
               <w:left w:w="57" w:type="dxa"/>
@@ -1242,7 +1241,7 @@
         <w:tc>
           <w:tcPr>
             <w:tcW w:w="4678" w:type="dxa"/>
-            <w:gridSpan w:val="17"/>
+            <w:gridSpan w:val="16"/>
             <w:tcMar>
               <w:top w:w="79" w:type="dxa"/>
               <w:left w:w="57" w:type="dxa"/>
@@ -1432,7 +1431,7 @@
         <w:tc>
           <w:tcPr>
             <w:tcW w:w="4678" w:type="dxa"/>
-            <w:gridSpan w:val="17"/>
+            <w:gridSpan w:val="16"/>
             <w:tcMar>
               <w:top w:w="79" w:type="dxa"/>
               <w:left w:w="57" w:type="dxa"/>
@@ -1622,7 +1621,7 @@
         <w:tc>
           <w:tcPr>
             <w:tcW w:w="4678" w:type="dxa"/>
-            <w:gridSpan w:val="17"/>
+            <w:gridSpan w:val="16"/>
             <w:tcMar>
               <w:top w:w="79" w:type="dxa"/>
               <w:left w:w="57" w:type="dxa"/>
@@ -1822,7 +1821,7 @@
         <w:tc>
           <w:tcPr>
             <w:tcW w:w="4678" w:type="dxa"/>
-            <w:gridSpan w:val="17"/>
+            <w:gridSpan w:val="16"/>
             <w:tcMar>
               <w:top w:w="79" w:type="dxa"/>
               <w:left w:w="57" w:type="dxa"/>
@@ -2031,7 +2030,7 @@
         <w:tc>
           <w:tcPr>
             <w:tcW w:w="4678" w:type="dxa"/>
-            <w:gridSpan w:val="17"/>
+            <w:gridSpan w:val="16"/>
             <w:tcMar>
               <w:top w:w="79" w:type="dxa"/>
               <w:left w:w="57" w:type="dxa"/>
@@ -2221,7 +2220,7 @@
         <w:tc>
           <w:tcPr>
             <w:tcW w:w="4678" w:type="dxa"/>
-            <w:gridSpan w:val="17"/>
+            <w:gridSpan w:val="16"/>
             <w:tcMar>
               <w:top w:w="79" w:type="dxa"/>
               <w:left w:w="57" w:type="dxa"/>
@@ -2411,7 +2410,7 @@
         <w:tc>
           <w:tcPr>
             <w:tcW w:w="4678" w:type="dxa"/>
-            <w:gridSpan w:val="17"/>
+            <w:gridSpan w:val="16"/>
             <w:tcMar>
               <w:top w:w="79" w:type="dxa"/>
               <w:left w:w="57" w:type="dxa"/>
@@ -2601,7 +2600,7 @@
         <w:tc>
           <w:tcPr>
             <w:tcW w:w="4678" w:type="dxa"/>
-            <w:gridSpan w:val="17"/>
+            <w:gridSpan w:val="16"/>
             <w:tcMar>
               <w:top w:w="79" w:type="dxa"/>
               <w:left w:w="57" w:type="dxa"/>
@@ -2791,7 +2790,7 @@
         <w:tc>
           <w:tcPr>
             <w:tcW w:w="4678" w:type="dxa"/>
-            <w:gridSpan w:val="17"/>
+            <w:gridSpan w:val="16"/>
             <w:tcMar>
               <w:top w:w="79" w:type="dxa"/>
               <w:left w:w="57" w:type="dxa"/>
@@ -2983,7 +2982,7 @@
         <w:tc>
           <w:tcPr>
             <w:tcW w:w="4678" w:type="dxa"/>
-            <w:gridSpan w:val="17"/>
+            <w:gridSpan w:val="16"/>
             <w:tcMar>
               <w:top w:w="79" w:type="dxa"/>
               <w:left w:w="57" w:type="dxa"/>
@@ -3187,7 +3186,7 @@
         <w:tc>
           <w:tcPr>
             <w:tcW w:w="4678" w:type="dxa"/>
-            <w:gridSpan w:val="17"/>
+            <w:gridSpan w:val="16"/>
             <w:tcMar>
               <w:top w:w="79" w:type="dxa"/>
               <w:left w:w="57" w:type="dxa"/>
@@ -3391,7 +3390,7 @@
         <w:tc>
           <w:tcPr>
             <w:tcW w:w="4678" w:type="dxa"/>
-            <w:gridSpan w:val="17"/>
+            <w:gridSpan w:val="16"/>
             <w:tcMar>
               <w:top w:w="79" w:type="dxa"/>
               <w:left w:w="57" w:type="dxa"/>
@@ -3595,7 +3594,7 @@
         <w:tc>
           <w:tcPr>
             <w:tcW w:w="4678" w:type="dxa"/>
-            <w:gridSpan w:val="17"/>
+            <w:gridSpan w:val="16"/>
             <w:tcMar>
               <w:top w:w="79" w:type="dxa"/>
               <w:left w:w="57" w:type="dxa"/>
@@ -3799,7 +3798,7 @@
         <w:tc>
           <w:tcPr>
             <w:tcW w:w="4678" w:type="dxa"/>
-            <w:gridSpan w:val="17"/>
+            <w:gridSpan w:val="16"/>
             <w:tcMar>
               <w:top w:w="79" w:type="dxa"/>
               <w:left w:w="57" w:type="dxa"/>
@@ -4003,7 +4002,7 @@
         <w:tc>
           <w:tcPr>
             <w:tcW w:w="4678" w:type="dxa"/>
-            <w:gridSpan w:val="17"/>
+            <w:gridSpan w:val="16"/>
             <w:tcMar>
               <w:top w:w="79" w:type="dxa"/>
               <w:left w:w="57" w:type="dxa"/>
@@ -4207,7 +4206,7 @@
         <w:tc>
           <w:tcPr>
             <w:tcW w:w="4678" w:type="dxa"/>
-            <w:gridSpan w:val="17"/>
+            <w:gridSpan w:val="16"/>
             <w:tcMar>
               <w:top w:w="79" w:type="dxa"/>
               <w:left w:w="57" w:type="dxa"/>
@@ -4386,7 +4385,7 @@
         <w:tc>
           <w:tcPr>
             <w:tcW w:w="10206" w:type="dxa"/>
-            <w:gridSpan w:val="36"/>
+            <w:gridSpan w:val="35"/>
             <w:shd w:val="clear" w:color="auto" w:fill="005B8C"/>
             <w:noWrap/>
             <w:tcMar>
@@ -4438,8 +4437,8 @@
         </w:trPr>
         <w:tc>
           <w:tcPr>
-            <w:tcW w:w="1597" w:type="dxa"/>
-            <w:gridSpan w:val="5"/>
+            <w:tcW w:w="2127" w:type="dxa"/>
+            <w:gridSpan w:val="7"/>
             <w:tcBorders>
               <w:bottom w:val="single" w:sz="4" w:space="0" w:color="ADADAD" w:themeColor="background2" w:themeShade="BF"/>
             </w:tcBorders>
@@ -4476,8 +4475,8 @@
         </w:tc>
         <w:tc>
           <w:tcPr>
-            <w:tcW w:w="3553" w:type="dxa"/>
-            <w:gridSpan w:val="12"/>
+            <w:tcW w:w="3023" w:type="dxa"/>
+            <w:gridSpan w:val="9"/>
             <w:tcBorders>
               <w:bottom w:val="single" w:sz="4" w:space="0" w:color="ADADAD" w:themeColor="background2" w:themeShade="BF"/>
               <w:right w:val="nil"/>
@@ -4538,7 +4537,7 @@
         <w:tc>
           <w:tcPr>
             <w:tcW w:w="10206" w:type="dxa"/>
-            <w:gridSpan w:val="36"/>
+            <w:gridSpan w:val="35"/>
             <w:tcBorders>
               <w:left w:val="nil"/>
               <w:bottom w:val="nil"/>
@@ -4576,7 +4575,7 @@
         <w:tc>
           <w:tcPr>
             <w:tcW w:w="10206" w:type="dxa"/>
-            <w:gridSpan w:val="36"/>
+            <w:gridSpan w:val="35"/>
             <w:tcBorders>
               <w:top w:val="nil"/>
             </w:tcBorders>
@@ -4631,7 +4630,7 @@
         <w:tc>
           <w:tcPr>
             <w:tcW w:w="10206" w:type="dxa"/>
-            <w:gridSpan w:val="36"/>
+            <w:gridSpan w:val="35"/>
             <w:shd w:val="clear" w:color="auto" w:fill="DAEAF5"/>
             <w:noWrap/>
             <w:tcMar>
@@ -4672,7 +4671,7 @@
         <w:tc>
           <w:tcPr>
             <w:tcW w:w="10206" w:type="dxa"/>
-            <w:gridSpan w:val="36"/>
+            <w:gridSpan w:val="35"/>
             <w:noWrap/>
             <w:tcMar>
               <w:top w:w="79" w:type="dxa"/>
@@ -4702,7 +4701,7 @@
         <w:tc>
           <w:tcPr>
             <w:tcW w:w="10206" w:type="dxa"/>
-            <w:gridSpan w:val="36"/>
+            <w:gridSpan w:val="35"/>
             <w:shd w:val="clear" w:color="auto" w:fill="DAEAF5"/>
             <w:noWrap/>
             <w:tcMar>
@@ -4742,7 +4741,7 @@
         <w:tc>
           <w:tcPr>
             <w:tcW w:w="10206" w:type="dxa"/>
-            <w:gridSpan w:val="36"/>
+            <w:gridSpan w:val="35"/>
             <w:noWrap/>
             <w:tcMar>
               <w:top w:w="79" w:type="dxa"/>
@@ -4771,7 +4770,7 @@
         <w:tc>
           <w:tcPr>
             <w:tcW w:w="10206" w:type="dxa"/>
-            <w:gridSpan w:val="36"/>
+            <w:gridSpan w:val="35"/>
             <w:shd w:val="clear" w:color="auto" w:fill="DAEAF5"/>
             <w:noWrap/>
             <w:tcMar>
@@ -4811,7 +4810,7 @@
         <w:tc>
           <w:tcPr>
             <w:tcW w:w="10206" w:type="dxa"/>
-            <w:gridSpan w:val="36"/>
+            <w:gridSpan w:val="35"/>
             <w:noWrap/>
             <w:tcMar>
               <w:top w:w="79" w:type="dxa"/>
@@ -4840,7 +4839,7 @@
         <w:tc>
           <w:tcPr>
             <w:tcW w:w="1843" w:type="dxa"/>
-            <w:gridSpan w:val="7"/>
+            <w:gridSpan w:val="6"/>
             <w:shd w:val="clear" w:color="auto" w:fill="DAEAF5"/>
             <w:noWrap/>
             <w:tcMar>
@@ -5010,7 +5009,7 @@
         <w:tc>
           <w:tcPr>
             <w:tcW w:w="1843" w:type="dxa"/>
-            <w:gridSpan w:val="7"/>
+            <w:gridSpan w:val="6"/>
             <w:shd w:val="clear" w:color="auto" w:fill="DAEAF5"/>
             <w:noWrap/>
             <w:tcMar>
@@ -5144,7 +5143,7 @@
         <w:tc>
           <w:tcPr>
             <w:tcW w:w="10206" w:type="dxa"/>
-            <w:gridSpan w:val="36"/>
+            <w:gridSpan w:val="35"/>
             <w:shd w:val="clear" w:color="auto" w:fill="005B8C"/>
             <w:noWrap/>
             <w:tcMar>
@@ -5189,7 +5188,7 @@
         <w:tc>
           <w:tcPr>
             <w:tcW w:w="10206" w:type="dxa"/>
-            <w:gridSpan w:val="36"/>
+            <w:gridSpan w:val="35"/>
             <w:noWrap/>
             <w:tcMar>
               <w:top w:w="79" w:type="dxa"/>
@@ -5233,7 +5232,7 @@
         <w:tc>
           <w:tcPr>
             <w:tcW w:w="1726" w:type="dxa"/>
-            <w:gridSpan w:val="6"/>
+            <w:gridSpan w:val="5"/>
             <w:shd w:val="clear" w:color="auto" w:fill="DAEAF5"/>
             <w:noWrap/>
             <w:tcMar>
@@ -5372,7 +5371,7 @@
         <w:tc>
           <w:tcPr>
             <w:tcW w:w="10206" w:type="dxa"/>
-            <w:gridSpan w:val="36"/>
+            <w:gridSpan w:val="35"/>
             <w:noWrap/>
             <w:tcMar>
               <w:top w:w="79" w:type="dxa"/>
@@ -5450,7 +5449,7 @@
         <w:tc>
           <w:tcPr>
             <w:tcW w:w="2747" w:type="dxa"/>
-            <w:gridSpan w:val="10"/>
+            <w:gridSpan w:val="9"/>
             <w:noWrap/>
             <w:tcMar>
               <w:top w:w="79" w:type="dxa"/>
@@ -5681,7 +5680,7 @@
         <w:tc>
           <w:tcPr>
             <w:tcW w:w="9227" w:type="dxa"/>
-            <w:gridSpan w:val="34"/>
+            <w:gridSpan w:val="33"/>
             <w:noWrap/>
             <w:tcMar>
               <w:top w:w="79" w:type="dxa"/>
@@ -5745,7 +5744,7 @@
         <w:tc>
           <w:tcPr>
             <w:tcW w:w="1148" w:type="dxa"/>
-            <w:gridSpan w:val="6"/>
+            <w:gridSpan w:val="5"/>
             <w:noWrap/>
             <w:tcMar>
               <w:top w:w="79" w:type="dxa"/>
@@ -5945,7 +5944,7 @@
         <w:tc>
           <w:tcPr>
             <w:tcW w:w="2552" w:type="dxa"/>
-            <w:gridSpan w:val="9"/>
+            <w:gridSpan w:val="8"/>
             <w:shd w:val="clear" w:color="auto" w:fill="DAEAF5"/>
             <w:noWrap/>
             <w:tcMar>
@@ -6067,7 +6066,7 @@
         <w:tc>
           <w:tcPr>
             <w:tcW w:w="10206" w:type="dxa"/>
-            <w:gridSpan w:val="36"/>
+            <w:gridSpan w:val="35"/>
             <w:tcBorders>
               <w:top w:val="single" w:sz="4" w:space="0" w:color="A6A6A6"/>
               <w:left w:val="single" w:sz="4" w:space="0" w:color="A6A6A6"/>
@@ -6143,7 +6142,7 @@
         <w:tc>
           <w:tcPr>
             <w:tcW w:w="2268" w:type="dxa"/>
-            <w:gridSpan w:val="8"/>
+            <w:gridSpan w:val="7"/>
             <w:tcBorders>
               <w:top w:val="single" w:sz="4" w:space="0" w:color="A6A6A6"/>
               <w:left w:val="single" w:sz="4" w:space="0" w:color="A6A6A6"/>
@@ -6394,7 +6393,7 @@
         <w:tc>
           <w:tcPr>
             <w:tcW w:w="2268" w:type="dxa"/>
-            <w:gridSpan w:val="8"/>
+            <w:gridSpan w:val="7"/>
             <w:tcBorders>
               <w:top w:val="single" w:sz="4" w:space="0" w:color="A6A6A6"/>
               <w:left w:val="single" w:sz="4" w:space="0" w:color="A6A6A6"/>
@@ -6578,7 +6577,7 @@
         <w:tc>
           <w:tcPr>
             <w:tcW w:w="2268" w:type="dxa"/>
-            <w:gridSpan w:val="8"/>
+            <w:gridSpan w:val="7"/>
             <w:tcBorders>
               <w:top w:val="single" w:sz="4" w:space="0" w:color="A6A6A6"/>
               <w:left w:val="single" w:sz="4" w:space="0" w:color="A6A6A6"/>
@@ -6762,7 +6761,7 @@
         <w:tc>
           <w:tcPr>
             <w:tcW w:w="2268" w:type="dxa"/>
-            <w:gridSpan w:val="8"/>
+            <w:gridSpan w:val="7"/>
             <w:tcBorders>
               <w:top w:val="single" w:sz="4" w:space="0" w:color="A6A6A6"/>
               <w:left w:val="single" w:sz="4" w:space="0" w:color="A6A6A6"/>
@@ -6962,7 +6961,7 @@
         <w:tc>
           <w:tcPr>
             <w:tcW w:w="2268" w:type="dxa"/>
-            <w:gridSpan w:val="8"/>
+            <w:gridSpan w:val="7"/>
             <w:tcBorders>
               <w:top w:val="single" w:sz="4" w:space="0" w:color="A6A6A6"/>
               <w:left w:val="single" w:sz="4" w:space="0" w:color="A6A6A6"/>
@@ -7154,7 +7153,7 @@
         <w:tc>
           <w:tcPr>
             <w:tcW w:w="2268" w:type="dxa"/>
-            <w:gridSpan w:val="8"/>
+            <w:gridSpan w:val="7"/>
             <w:tcBorders>
               <w:top w:val="single" w:sz="4" w:space="0" w:color="A6A6A6"/>
               <w:left w:val="single" w:sz="4" w:space="0" w:color="A6A6A6"/>
@@ -7478,7 +7477,31 @@
               <w:szCs w:val="10"/>
               <w:lang w:val="en-US" w:eastAsia="en-US"/>
             </w:rPr>
-            <w:t xml:space="preserve">web http://www.cbsm.it  email </w:t>
+            <w:t xml:space="preserve">web </w:t>
+          </w:r>
+          <w:proofErr w:type="gramStart"/>
+          <w:r>
+            <w:rPr>
+              <w:rFonts w:ascii="Arial" w:eastAsia="Arial" w:hAnsi="Arial" w:cs="Arial"/>
+              <w:bCs/>
+              <w:color w:val="auto"/>
+              <w:sz w:val="10"/>
+              <w:szCs w:val="10"/>
+              <w:lang w:val="en-US" w:eastAsia="en-US"/>
+            </w:rPr>
+            <w:t>http://www.cbsm.it  email</w:t>
+          </w:r>
+          <w:proofErr w:type="gramEnd"/>
+          <w:r>
+            <w:rPr>
+              <w:rFonts w:ascii="Arial" w:eastAsia="Arial" w:hAnsi="Arial" w:cs="Arial"/>
+              <w:bCs/>
+              <w:color w:val="auto"/>
+              <w:sz w:val="10"/>
+              <w:szCs w:val="10"/>
+              <w:lang w:val="en-US" w:eastAsia="en-US"/>
+            </w:rPr>
+            <w:t xml:space="preserve"> </w:t>
           </w:r>
           <w:hyperlink r:id="rId1" w:history="1">
             <w:r>

</xml_diff>

<commit_message>
feat(gii-editing-ti): completa il popup Art. 30 per rimborsi attrezzature e decurtazione cauzione
</commit_message>
<xml_diff>
--- a/your-extensions/widgets/_shared/gii-anteprime/rapporto/rapporto-template.docx
+++ b/your-extensions/widgets/_shared/gii-anteprime/rapporto/rapporto-template.docx
@@ -1066,7 +1066,7 @@
                 <w:sz w:val="20"/>
                 <w:szCs w:val="20"/>
               </w:rPr>
-              <w:t>Violazione servizio reperibilità</w:t>
+              <w:t>Violazione servizio di reperibilità</w:t>
             </w:r>
           </w:p>
         </w:tc>
@@ -1646,17 +1646,15 @@
                 <w:sz w:val="20"/>
                 <w:szCs w:val="20"/>
               </w:rPr>
-              <w:t>Inosservanza termini presentazione comunicazioni</w:t>
-            </w:r>
-            <w:r>
-              <w:rPr>
-                <w:rFonts w:ascii="Calibri" w:hAnsi="Calibri" w:cs="Calibri"/>
-                <w:color w:val="005B8C"/>
-                <w:sz w:val="20"/>
-                <w:szCs w:val="20"/>
-              </w:rPr>
-              <w:br/>
-              <w:t>(comunicazione di irrigazione tardiva)</w:t>
+              <w:t>Presentazione tardiva comunicazione di irrigazione</w:t>
+            </w:r>
+            <w:r>
+              <w:rPr>
+                <w:rFonts w:ascii="Calibri" w:hAnsi="Calibri" w:cs="Calibri"/>
+                <w:color w:val="005B8C"/>
+                <w:sz w:val="20"/>
+                <w:szCs w:val="20"/>
+              </w:rPr>
             </w:r>
           </w:p>
         </w:tc>
@@ -1846,26 +1844,7 @@
                 <w:sz w:val="20"/>
                 <w:szCs w:val="20"/>
               </w:rPr>
-              <w:t>Inosservanza termini presentazione comunicazioni</w:t>
-            </w:r>
-          </w:p>
-          <w:p>
-            <w:pPr>
-              <w:rPr>
-                <w:rFonts w:ascii="Calibri" w:hAnsi="Calibri" w:cs="Calibri"/>
-                <w:color w:val="005B8C"/>
-                <w:sz w:val="20"/>
-                <w:szCs w:val="20"/>
-              </w:rPr>
-            </w:pPr>
-            <w:r>
-              <w:rPr>
-                <w:rFonts w:ascii="Calibri" w:hAnsi="Calibri" w:cs="Calibri"/>
-                <w:color w:val="005B8C"/>
-                <w:sz w:val="20"/>
-                <w:szCs w:val="20"/>
-              </w:rPr>
-              <w:t>(comunicazione di variazione o di rinuncia tardiva)</w:t>
+              <w:t>Presentazione tardiva comunicazione di variazione o di rinuncia</w:t>
             </w:r>
           </w:p>
         </w:tc>
@@ -2055,7 +2034,7 @@
                 <w:sz w:val="20"/>
                 <w:szCs w:val="20"/>
               </w:rPr>
-              <w:t>Spreco d’acqua / Uso negligente risorsa idrica</w:t>
+              <w:t>Spreco d’acqua/uso negligente della risorsa idrica</w:t>
             </w:r>
           </w:p>
         </w:tc>
@@ -2245,7 +2224,7 @@
                 <w:sz w:val="20"/>
                 <w:szCs w:val="20"/>
               </w:rPr>
-              <w:t>Violazione prescrizioni del Consorzio</w:t>
+              <w:t>Violazione prescrizioni del consorzio</w:t>
             </w:r>
           </w:p>
         </w:tc>
@@ -4233,7 +4212,7 @@
                 <w:sz w:val="20"/>
                 <w:szCs w:val="20"/>
               </w:rPr>
-              <w:t>Danni strutture irrigue</w:t>
+              <w:t>Danni alle strutture irrigue</w:t>
             </w:r>
           </w:p>
         </w:tc>

</xml_diff>